<commit_message>
Match consent typography to supplied Arabic document
</commit_message>
<xml_diff>
--- a/output/documents/al-naeem-terms-consent.docx
+++ b/output/documents/al-naeem-terms-consent.docx
@@ -4,19 +4,19 @@
   <w:body>
     <w:p>
       <w:pPr>
-        <w:spacing w:line="480" w:lineRule="exact" w:after="520"/>
+        <w:spacing w:line="340" w:lineRule="exact" w:after="280"/>
         <w:jc w:val="start"/>
         <w:bidi/>
       </w:pPr>
       <w:r>
         <w:rPr>
-          <w:rFonts w:ascii="Arial" w:hAnsi="Arial" w:cs="Arial"/>
+          <w:rFonts w:ascii="Bahij TheSansArabic Plain" w:hAnsi="Bahij TheSansArabic Plain" w:cs="Bahij TheSansArabic Plain"/>
           <w:b w:val="0"/>
           <w:color w:val="000000"/>
-          <w:sz w:val="24"/>
+          <w:sz w:val="19"/>
           <w:u w:val="none"/>
           <w:rtl/>
-          <w:szCs w:val="24"/>
+          <w:szCs w:val="19"/>
           <w:lang w:bidi="ar-SA"/>
         </w:rPr>
         <w:t>إتقان كابيتال | صندوق النعيم العقاري</w:t>
@@ -25,40 +25,39 @@
     <w:p>
       <w:pPr>
         <w:pStyle w:val="Title"/>
-        <w:spacing w:line="480" w:lineRule="exact" w:after="100"/>
+        <w:spacing w:line="340" w:lineRule="exact" w:after="20"/>
         <w:jc w:val="start"/>
         <w:bidi/>
       </w:pPr>
       <w:r>
         <w:rPr>
-          <w:rFonts w:ascii="Arial" w:hAnsi="Arial" w:cs="Arial"/>
-          <w:b/>
+          <w:rFonts w:ascii="Bahij TheSansArabic Plain" w:hAnsi="Bahij TheSansArabic Plain" w:cs="Bahij TheSansArabic Plain"/>
+          <w:b w:val="0"/>
           <w:color w:val="000000"/>
-          <w:sz w:val="30"/>
+          <w:sz w:val="21"/>
           <w:u w:val="single"/>
           <w:rtl/>
-          <w:szCs w:val="30"/>
+          <w:szCs w:val="21"/>
           <w:lang w:bidi="ar-SA"/>
-          <w:bCs/>
         </w:rPr>
         <w:t>إقرار من مالكي الوحدات:</w:t>
       </w:r>
     </w:p>
     <w:p>
       <w:pPr>
-        <w:spacing w:line="480" w:lineRule="exact" w:after="840"/>
+        <w:spacing w:line="340" w:lineRule="exact" w:after="660"/>
         <w:jc w:val="both"/>
         <w:bidi/>
       </w:pPr>
       <w:r>
         <w:rPr>
-          <w:rFonts w:ascii="Arial" w:hAnsi="Arial" w:cs="Arial"/>
+          <w:rFonts w:ascii="Bahij TheSansArabic Plain" w:hAnsi="Bahij TheSansArabic Plain" w:cs="Bahij TheSansArabic Plain"/>
           <w:b w:val="0"/>
           <w:color w:val="000000"/>
-          <w:sz w:val="28"/>
+          <w:sz w:val="18"/>
           <w:u w:val="none"/>
           <w:rtl/>
-          <w:szCs w:val="28"/>
+          <w:szCs w:val="18"/>
           <w:lang w:bidi="ar-SA"/>
         </w:rPr>
         <w:t>لقد قمت / قمنا بقراءة الشروط والأحكام والملاحق الخاصة بالصندوق وفهم ما جاء فيها والموافقة عليها، كما جرى الحصول على نسخة منها بعد التوقيع عليها. وإثباتاً لما تقدم، قام المستثمر بالتوقيع على هذه الشروط والأحكام الخاصة بالصندوق في التاريخ والسنة المذكورين أدناه.</w:t>
@@ -66,21 +65,20 @@
     </w:p>
     <w:p>
       <w:pPr>
-        <w:spacing w:line="480" w:lineRule="exact" w:after="240"/>
+        <w:spacing w:line="340" w:lineRule="exact" w:after="160"/>
         <w:jc w:val="start"/>
         <w:bidi/>
       </w:pPr>
       <w:r>
         <w:rPr>
-          <w:rFonts w:ascii="Arial" w:hAnsi="Arial" w:cs="Arial"/>
-          <w:b/>
+          <w:rFonts w:ascii="Bahij TheSansArabic Plain" w:hAnsi="Bahij TheSansArabic Plain" w:cs="Bahij TheSansArabic Plain"/>
+          <w:b w:val="0"/>
           <w:color w:val="000000"/>
-          <w:sz w:val="30"/>
+          <w:sz w:val="21"/>
           <w:u w:val="single"/>
           <w:rtl/>
-          <w:szCs w:val="30"/>
+          <w:szCs w:val="21"/>
           <w:lang w:bidi="ar-SA"/>
-          <w:bCs/>
         </w:rPr>
         <w:t>من قبل المستثمر</w:t>
       </w:r>
@@ -106,7 +104,7 @@
       </w:tblGrid>
       <w:tr>
         <w:trPr>
-          <w:trHeight w:val="737" w:hRule="exact"/>
+          <w:trHeight w:val="567" w:hRule="exact"/>
         </w:trPr>
         <w:tc>
           <w:tcPr>
@@ -115,7 +113,7 @@
           </w:tcPr>
           <w:p>
             <w:pPr>
-              <w:spacing w:line="400" w:lineRule="exact" w:after="0"/>
+              <w:spacing w:line="340" w:lineRule="exact" w:after="0"/>
               <w:jc w:val="start"/>
               <w:bidi/>
               <w:pBdr>
@@ -131,19 +129,19 @@
           </w:tcPr>
           <w:p>
             <w:pPr>
-              <w:spacing w:line="480" w:lineRule="exact" w:after="0"/>
+              <w:spacing w:line="340" w:lineRule="exact" w:after="0"/>
               <w:jc w:val="start"/>
               <w:bidi/>
             </w:pPr>
             <w:r>
               <w:rPr>
-                <w:rFonts w:ascii="Arial" w:hAnsi="Arial" w:cs="Arial"/>
+                <w:rFonts w:ascii="Bahij TheSansArabic Plain" w:hAnsi="Bahij TheSansArabic Plain" w:cs="Bahij TheSansArabic Plain"/>
                 <w:b w:val="0"/>
                 <w:color w:val="000000"/>
-                <w:sz w:val="28"/>
+                <w:sz w:val="19"/>
                 <w:u w:val="none"/>
                 <w:rtl/>
-                <w:szCs w:val="28"/>
+                <w:szCs w:val="19"/>
                 <w:lang w:bidi="ar-SA"/>
               </w:rPr>
               <w:t>الاسم:</w:t>
@@ -153,7 +151,7 @@
       </w:tr>
       <w:tr>
         <w:trPr>
-          <w:trHeight w:val="737" w:hRule="exact"/>
+          <w:trHeight w:val="567" w:hRule="exact"/>
         </w:trPr>
         <w:tc>
           <w:tcPr>
@@ -162,7 +160,7 @@
           </w:tcPr>
           <w:p>
             <w:pPr>
-              <w:spacing w:line="400" w:lineRule="exact" w:after="0"/>
+              <w:spacing w:line="340" w:lineRule="exact" w:after="0"/>
               <w:jc w:val="start"/>
               <w:bidi/>
               <w:pBdr>
@@ -178,19 +176,19 @@
           </w:tcPr>
           <w:p>
             <w:pPr>
-              <w:spacing w:line="480" w:lineRule="exact" w:after="0"/>
+              <w:spacing w:line="340" w:lineRule="exact" w:after="0"/>
               <w:jc w:val="start"/>
               <w:bidi/>
             </w:pPr>
             <w:r>
               <w:rPr>
-                <w:rFonts w:ascii="Arial" w:hAnsi="Arial" w:cs="Arial"/>
+                <w:rFonts w:ascii="Bahij TheSansArabic Plain" w:hAnsi="Bahij TheSansArabic Plain" w:cs="Bahij TheSansArabic Plain"/>
                 <w:b w:val="0"/>
                 <w:color w:val="000000"/>
-                <w:sz w:val="28"/>
+                <w:sz w:val="19"/>
                 <w:u w:val="none"/>
                 <w:rtl/>
-                <w:szCs w:val="28"/>
+                <w:szCs w:val="19"/>
                 <w:lang w:bidi="ar-SA"/>
               </w:rPr>
               <w:t>التوقيع:</w:t>
@@ -200,7 +198,7 @@
       </w:tr>
       <w:tr>
         <w:trPr>
-          <w:trHeight w:val="737" w:hRule="exact"/>
+          <w:trHeight w:val="567" w:hRule="exact"/>
         </w:trPr>
         <w:tc>
           <w:tcPr>
@@ -209,7 +207,7 @@
           </w:tcPr>
           <w:p>
             <w:pPr>
-              <w:spacing w:line="400" w:lineRule="exact" w:after="0"/>
+              <w:spacing w:line="340" w:lineRule="exact" w:after="0"/>
               <w:jc w:val="start"/>
               <w:bidi/>
               <w:pBdr>
@@ -225,19 +223,19 @@
           </w:tcPr>
           <w:p>
             <w:pPr>
-              <w:spacing w:line="480" w:lineRule="exact" w:after="0"/>
+              <w:spacing w:line="340" w:lineRule="exact" w:after="0"/>
               <w:jc w:val="start"/>
               <w:bidi/>
             </w:pPr>
             <w:r>
               <w:rPr>
-                <w:rFonts w:ascii="Arial" w:hAnsi="Arial" w:cs="Arial"/>
+                <w:rFonts w:ascii="Bahij TheSansArabic Plain" w:hAnsi="Bahij TheSansArabic Plain" w:cs="Bahij TheSansArabic Plain"/>
                 <w:b w:val="0"/>
                 <w:color w:val="000000"/>
-                <w:sz w:val="28"/>
+                <w:sz w:val="19"/>
                 <w:u w:val="none"/>
                 <w:rtl/>
-                <w:szCs w:val="28"/>
+                <w:szCs w:val="19"/>
                 <w:lang w:bidi="ar-SA"/>
               </w:rPr>
               <w:t>التاريخ:</w:t>
@@ -248,7 +246,7 @@
     </w:tbl>
     <w:p>
       <w:pPr>
-        <w:spacing w:line="20" w:lineRule="exact" w:after="1740"/>
+        <w:spacing w:line="20" w:lineRule="exact" w:after="1840"/>
         <w:jc w:val="start"/>
         <w:bidi/>
       </w:pPr>
@@ -278,42 +276,40 @@
           </w:tcPr>
           <w:p>
             <w:pPr>
-              <w:spacing w:line="480" w:lineRule="exact" w:after="0"/>
+              <w:spacing w:line="340" w:lineRule="exact" w:after="0"/>
               <w:jc w:val="center"/>
               <w:bidi/>
             </w:pPr>
             <w:r>
               <w:rPr>
-                <w:rFonts w:ascii="Arial" w:hAnsi="Arial" w:cs="Arial"/>
-                <w:b/>
+                <w:rFonts w:ascii="Bahij TheSansArabic Plain" w:hAnsi="Bahij TheSansArabic Plain" w:cs="Bahij TheSansArabic Plain"/>
+                <w:b w:val="0"/>
                 <w:color w:val="000000"/>
-                <w:sz w:val="28"/>
+                <w:sz w:val="21"/>
                 <w:u w:val="none"/>
                 <w:rtl/>
-                <w:szCs w:val="28"/>
+                <w:szCs w:val="21"/>
                 <w:lang w:bidi="ar-SA"/>
-                <w:bCs/>
               </w:rPr>
               <w:t>العضو المنتدب والرئيس التنفيذي</w:t>
             </w:r>
           </w:p>
           <w:p>
             <w:pPr>
-              <w:spacing w:line="480" w:lineRule="exact" w:after="0"/>
+              <w:spacing w:line="340" w:lineRule="exact" w:after="0"/>
               <w:jc w:val="center"/>
               <w:bidi/>
             </w:pPr>
             <w:r>
               <w:rPr>
-                <w:rFonts w:ascii="Arial" w:hAnsi="Arial" w:cs="Arial"/>
-                <w:b/>
+                <w:rFonts w:ascii="Bahij TheSansArabic Plain" w:hAnsi="Bahij TheSansArabic Plain" w:cs="Bahij TheSansArabic Plain"/>
+                <w:b w:val="0"/>
                 <w:color w:val="000000"/>
-                <w:sz w:val="28"/>
+                <w:sz w:val="21"/>
                 <w:u w:val="none"/>
                 <w:rtl/>
-                <w:szCs w:val="28"/>
+                <w:szCs w:val="21"/>
                 <w:lang w:bidi="ar-SA"/>
-                <w:bCs/>
               </w:rPr>
               <w:t>د. محمد بسام هاشم السيد</w:t>
             </w:r>
@@ -325,42 +321,40 @@
           </w:tcPr>
           <w:p>
             <w:pPr>
-              <w:spacing w:line="480" w:lineRule="exact" w:after="0"/>
+              <w:spacing w:line="340" w:lineRule="exact" w:after="0"/>
               <w:jc w:val="center"/>
               <w:bidi/>
             </w:pPr>
             <w:r>
               <w:rPr>
-                <w:rFonts w:ascii="Arial" w:hAnsi="Arial" w:cs="Arial"/>
-                <w:b/>
+                <w:rFonts w:ascii="Bahij TheSansArabic Plain" w:hAnsi="Bahij TheSansArabic Plain" w:cs="Bahij TheSansArabic Plain"/>
+                <w:b w:val="0"/>
                 <w:color w:val="000000"/>
-                <w:sz w:val="28"/>
+                <w:sz w:val="21"/>
                 <w:u w:val="none"/>
                 <w:rtl/>
-                <w:szCs w:val="28"/>
+                <w:szCs w:val="21"/>
                 <w:lang w:bidi="ar-SA"/>
-                <w:bCs/>
               </w:rPr>
               <w:t>مسؤول المطابقة والالتزام</w:t>
             </w:r>
           </w:p>
           <w:p>
             <w:pPr>
-              <w:spacing w:line="480" w:lineRule="exact" w:after="0"/>
+              <w:spacing w:line="340" w:lineRule="exact" w:after="0"/>
               <w:jc w:val="center"/>
               <w:bidi/>
             </w:pPr>
             <w:r>
               <w:rPr>
-                <w:rFonts w:ascii="Arial" w:hAnsi="Arial" w:cs="Arial"/>
-                <w:b/>
+                <w:rFonts w:ascii="Bahij TheSansArabic Plain" w:hAnsi="Bahij TheSansArabic Plain" w:cs="Bahij TheSansArabic Plain"/>
+                <w:b w:val="0"/>
                 <w:color w:val="000000"/>
-                <w:sz w:val="28"/>
+                <w:sz w:val="21"/>
                 <w:u w:val="none"/>
                 <w:rtl/>
-                <w:szCs w:val="28"/>
+                <w:szCs w:val="21"/>
                 <w:lang w:bidi="ar-SA"/>
-                <w:bCs/>
               </w:rPr>
               <w:t>أسامه فايز المالكي</w:t>
             </w:r>
@@ -370,7 +364,7 @@
     </w:tbl>
     <w:sectPr>
       <w:pgSz w:w="11906" w:h="16838"/>
-      <w:pgMar w:top="1361" w:right="1247" w:bottom="1247" w:left="1247" w:header="720" w:footer="720" w:gutter="0"/>
+      <w:pgMar w:top="1020" w:right="1247" w:bottom="1247" w:left="1247" w:header="720" w:footer="720" w:gutter="0"/>
       <w:cols w:space="720"/>
       <w:docGrid w:linePitch="360"/>
     </w:sectPr>
@@ -742,9 +736,9 @@
     <w:qFormat/>
     <w:rsid w:val="00FC693F"/>
     <w:rPr>
-      <w:rFonts w:ascii="Arial" w:hAnsi="Arial"/>
+      <w:rFonts w:ascii="Bahij TheSansArabic Plain" w:hAnsi="Bahij TheSansArabic Plain"/>
       <w:color w:val="000000"/>
-      <w:sz w:val="28"/>
+      <w:sz w:val="19"/>
     </w:rPr>
   </w:style>
   <w:style w:type="paragraph" w:styleId="Header">

</xml_diff>

<commit_message>
Unify PDF templates with subscription design and preserve historical layouts
</commit_message>
<xml_diff>
--- a/output/documents/al-naeem-terms-consent.docx
+++ b/output/documents/al-naeem-terms-consent.docx
@@ -4,81 +4,141 @@
   <w:body>
     <w:p>
       <w:pPr>
-        <w:spacing w:line="340" w:lineRule="exact" w:after="280"/>
-        <w:jc w:val="start"/>
-        <w:bidi/>
+        <w:keepNext/>
+        <w:spacing w:before="100" w:after="60" w:line="380" w:lineRule="exact"/>
+        <w:ind w:left="120" w:right="120"/>
+        <w:jc w:val="right"/>
+        <w:shd w:fill="401D58"/>
       </w:pPr>
       <w:r>
         <w:rPr>
+          <w:rFonts w:ascii="Arial" w:hAnsi="Arial" w:cs="Bahij TheSansArabic Plain"/>
+          <w:b/>
+          <w:color w:val="FFFFFF"/>
+          <w:sz w:val="17"/>
+        </w:rPr>
+      </w:r>
+      <w:r>
+        <w:rPr>
           <w:rFonts w:ascii="Bahij TheSansArabic Plain" w:hAnsi="Bahij TheSansArabic Plain" w:cs="Bahij TheSansArabic Plain"/>
+          <w:b/>
+          <w:color w:val="FFFFFF"/>
+          <w:sz w:val="20"/>
+          <w:rtl/>
+          <w:szCs w:val="20"/>
+          <w:bCs/>
+        </w:rPr>
+        <w:t>إقرار من مالكي الوحدات:</w:t>
+      </w:r>
+    </w:p>
+    <w:tbl>
+      <w:tblPr>
+        <w:tblW w:type="auto" w:w="0"/>
+        <w:jc w:val="center"/>
+        <w:tblLayout w:type="fixed"/>
+        <w:tblLook w:firstColumn="1" w:firstRow="1" w:lastColumn="0" w:lastRow="0" w:noHBand="0" w:noVBand="1" w:val="04A0"/>
+        <w:tblBorders>
+          <w:top w:val="nil" w:sz="3" w:color="9B92A2"/>
+          <w:bottom w:val="nil" w:sz="3" w:color="9B92A2"/>
+          <w:left w:val="nil" w:sz="3" w:color="9B92A2"/>
+          <w:right w:val="nil" w:sz="3" w:color="9B92A2"/>
+          <w:insideH w:val="nil" w:sz="3" w:color="9B92A2"/>
+          <w:insideV w:val="nil" w:sz="3" w:color="9B92A2"/>
+        </w:tblBorders>
+      </w:tblPr>
+      <w:tblGrid>
+        <w:gridCol w:w="9986"/>
+      </w:tblGrid>
+      <w:tr>
+        <w:tc>
+          <w:tcPr>
+            <w:tcW w:type="dxa" w:w="9986"/>
+            <w:tcMar>
+              <w:top w:w="65" w:type="dxa"/>
+              <w:bottom w:w="55" w:type="dxa"/>
+              <w:left w:w="100" w:type="dxa"/>
+              <w:right w:w="100" w:type="dxa"/>
+            </w:tcMar>
+          </w:tcPr>
+          <w:p>
+            <w:pPr>
+              <w:keepNext w:val="0"/>
+              <w:spacing w:before="0" w:after="0" w:line="280" w:lineRule="exact"/>
+              <w:jc w:val="start"/>
+              <w:bidi/>
+            </w:pPr>
+            <w:r>
+              <w:rPr>
+                <w:rFonts w:ascii="Bahij TheSansArabic Plain" w:hAnsi="Bahij TheSansArabic Plain" w:cs="Bahij TheSansArabic Plain"/>
+                <w:b w:val="0"/>
+                <w:color w:val="242235"/>
+                <w:sz w:val="20"/>
+                <w:rtl/>
+                <w:szCs w:val="20"/>
+              </w:rPr>
+              <w:t>لقد قمت / قمنا بقراءة الشروط والأحكام والملاحق الخاصة بالصندوق وفهم ما جاء فيها والموافقة عليها، كما جرى الحصول على نسخة منها بعد التوقيع عليها. وإثباتاً لما تقدم، قام المستثمر بالتوقيع على هذه الشروط والأحكام الخاصة بالصندوق في التاريخ والسنة المذكورين أدناه.</w:t>
+            </w:r>
+          </w:p>
+        </w:tc>
+      </w:tr>
+    </w:tbl>
+    <w:p>
+      <w:pPr>
+        <w:keepNext w:val="0"/>
+        <w:spacing w:before="0" w:after="0" w:line="60" w:lineRule="exact"/>
+        <w:jc w:val="left"/>
+      </w:pPr>
+      <w:r>
+        <w:rPr>
+          <w:rFonts w:ascii="Arial" w:hAnsi="Arial" w:cs="Bahij TheSansArabic Plain"/>
           <w:b w:val="0"/>
-          <w:color w:val="000000"/>
-          <w:sz w:val="19"/>
-          <w:u w:val="none"/>
-          <w:rtl/>
-          <w:szCs w:val="19"/>
-          <w:lang w:bidi="ar-SA"/>
+          <w:color w:val="242235"/>
+          <w:sz w:val="2"/>
         </w:rPr>
-        <w:t>إتقان كابيتال | صندوق النعيم العقاري</w:t>
+        <w:t xml:space="preserve"> </w:t>
       </w:r>
     </w:p>
     <w:p>
       <w:pPr>
-        <w:pStyle w:val="Title"/>
-        <w:spacing w:line="340" w:lineRule="exact" w:after="20"/>
-        <w:jc w:val="start"/>
-        <w:bidi/>
+        <w:keepNext w:val="0"/>
+        <w:spacing w:before="0" w:after="0" w:line="500" w:lineRule="exact"/>
+        <w:jc w:val="left"/>
       </w:pPr>
       <w:r>
         <w:rPr>
-          <w:rFonts w:ascii="Bahij TheSansArabic Plain" w:hAnsi="Bahij TheSansArabic Plain" w:cs="Bahij TheSansArabic Plain"/>
+          <w:rFonts w:ascii="Arial" w:hAnsi="Arial" w:cs="Bahij TheSansArabic Plain"/>
           <w:b w:val="0"/>
-          <w:color w:val="000000"/>
-          <w:sz w:val="21"/>
-          <w:u w:val="single"/>
-          <w:rtl/>
-          <w:szCs w:val="21"/>
-          <w:lang w:bidi="ar-SA"/>
+          <w:color w:val="242235"/>
+          <w:sz w:val="2"/>
         </w:rPr>
-        <w:t>إقرار من مالكي الوحدات:</w:t>
+        <w:t xml:space="preserve"> </w:t>
       </w:r>
     </w:p>
     <w:p>
       <w:pPr>
-        <w:spacing w:line="340" w:lineRule="exact" w:after="660"/>
-        <w:jc w:val="both"/>
-        <w:bidi/>
+        <w:keepNext/>
+        <w:spacing w:before="100" w:after="60" w:line="380" w:lineRule="exact"/>
+        <w:ind w:left="120" w:right="120"/>
+        <w:jc w:val="right"/>
+        <w:shd w:fill="401D58"/>
       </w:pPr>
       <w:r>
         <w:rPr>
-          <w:rFonts w:ascii="Bahij TheSansArabic Plain" w:hAnsi="Bahij TheSansArabic Plain" w:cs="Bahij TheSansArabic Plain"/>
-          <w:b w:val="0"/>
-          <w:color w:val="000000"/>
-          <w:sz w:val="18"/>
-          <w:u w:val="none"/>
-          <w:rtl/>
-          <w:szCs w:val="18"/>
-          <w:lang w:bidi="ar-SA"/>
+          <w:rFonts w:ascii="Arial" w:hAnsi="Arial" w:cs="Bahij TheSansArabic Plain"/>
+          <w:b/>
+          <w:color w:val="FFFFFF"/>
+          <w:sz w:val="17"/>
         </w:rPr>
-        <w:t>لقد قمت / قمنا بقراءة الشروط والأحكام والملاحق الخاصة بالصندوق وفهم ما جاء فيها والموافقة عليها، كما جرى الحصول على نسخة منها بعد التوقيع عليها. وإثباتاً لما تقدم، قام المستثمر بالتوقيع على هذه الشروط والأحكام الخاصة بالصندوق في التاريخ والسنة المذكورين أدناه.</w:t>
       </w:r>
-    </w:p>
-    <w:p>
-      <w:pPr>
-        <w:spacing w:line="340" w:lineRule="exact" w:after="160"/>
-        <w:jc w:val="start"/>
-        <w:bidi/>
-      </w:pPr>
       <w:r>
         <w:rPr>
           <w:rFonts w:ascii="Bahij TheSansArabic Plain" w:hAnsi="Bahij TheSansArabic Plain" w:cs="Bahij TheSansArabic Plain"/>
-          <w:b w:val="0"/>
-          <w:color w:val="000000"/>
-          <w:sz w:val="21"/>
-          <w:u w:val="single"/>
+          <w:b/>
+          <w:color w:val="FFFFFF"/>
+          <w:sz w:val="20"/>
           <w:rtl/>
-          <w:szCs w:val="21"/>
-          <w:lang w:bidi="ar-SA"/>
+          <w:szCs w:val="20"/>
+          <w:bCs/>
         </w:rPr>
         <w:t>من قبل المستثمر</w:t>
       </w:r>
@@ -86,50 +146,40 @@
     <w:tbl>
       <w:tblPr>
         <w:tblW w:type="auto" w:w="0"/>
-        <w:jc w:val="right"/>
+        <w:jc w:val="center"/>
         <w:tblLayout w:type="fixed"/>
         <w:tblLook w:firstColumn="1" w:firstRow="1" w:lastColumn="0" w:lastRow="0" w:noHBand="0" w:noVBand="1" w:val="04A0"/>
         <w:tblBorders>
-          <w:top w:val="nil"/>
-          <w:left w:val="nil"/>
-          <w:bottom w:val="nil"/>
-          <w:right w:val="nil"/>
-          <w:insideH w:val="nil"/>
-          <w:insideV w:val="nil"/>
+          <w:top w:val="single" w:sz="3" w:color="9B92A2"/>
+          <w:bottom w:val="single" w:sz="3" w:color="9B92A2"/>
+          <w:left w:val="single" w:sz="3" w:color="9B92A2"/>
+          <w:right w:val="single" w:sz="3" w:color="9B92A2"/>
+          <w:insideH w:val="single" w:sz="3" w:color="9B92A2"/>
+          <w:insideV w:val="single" w:sz="3" w:color="9B92A2"/>
         </w:tblBorders>
       </w:tblPr>
       <w:tblGrid>
-        <w:gridCol w:w="4762"/>
-        <w:gridCol w:w="1134"/>
+        <w:gridCol w:w="9986"/>
       </w:tblGrid>
       <w:tr>
         <w:trPr>
-          <w:trHeight w:val="567" w:hRule="exact"/>
+          <w:cantSplit/>
         </w:trPr>
         <w:tc>
           <w:tcPr>
-            <w:tcW w:type="dxa" w:w="4762"/>
-            <w:vAlign w:val="center"/>
+            <w:tcW w:type="dxa" w:w="9986"/>
+            <w:tcMar>
+              <w:top w:w="65" w:type="dxa"/>
+              <w:bottom w:w="55" w:type="dxa"/>
+              <w:left w:w="100" w:type="dxa"/>
+              <w:right w:w="100" w:type="dxa"/>
+            </w:tcMar>
+            <w:vAlign w:val="bottom"/>
           </w:tcPr>
           <w:p>
             <w:pPr>
-              <w:spacing w:line="340" w:lineRule="exact" w:after="0"/>
-              <w:jc w:val="start"/>
-              <w:bidi/>
-              <w:pBdr>
-                <w:bottom w:val="single" w:sz="4" w:color="555555" w:space="1"/>
-              </w:pBdr>
-            </w:pPr>
-          </w:p>
-        </w:tc>
-        <w:tc>
-          <w:tcPr>
-            <w:tcW w:type="dxa" w:w="1134"/>
-            <w:vAlign w:val="center"/>
-          </w:tcPr>
-          <w:p>
-            <w:pPr>
-              <w:spacing w:line="340" w:lineRule="exact" w:after="0"/>
+              <w:keepNext w:val="0"/>
+              <w:spacing w:before="0" w:after="0" w:line="260" w:lineRule="exact"/>
               <w:jc w:val="start"/>
               <w:bidi/>
             </w:pPr>
@@ -137,46 +187,100 @@
               <w:rPr>
                 <w:rFonts w:ascii="Bahij TheSansArabic Plain" w:hAnsi="Bahij TheSansArabic Plain" w:cs="Bahij TheSansArabic Plain"/>
                 <w:b w:val="0"/>
-                <w:color w:val="000000"/>
+                <w:color w:val="242235"/>
                 <w:sz w:val="19"/>
-                <w:u w:val="none"/>
                 <w:rtl/>
                 <w:szCs w:val="19"/>
-                <w:lang w:bidi="ar-SA"/>
               </w:rPr>
               <w:t>الاسم:</w:t>
             </w:r>
           </w:p>
+          <w:p>
+            <w:pPr>
+              <w:keepNext w:val="0"/>
+              <w:spacing w:before="0" w:after="0" w:line="220" w:lineRule="exact"/>
+              <w:jc w:val="left"/>
+            </w:pPr>
+            <w:r>
+              <w:rPr>
+                <w:rFonts w:ascii="Arial" w:hAnsi="Arial" w:cs="Bahij TheSansArabic Plain"/>
+                <w:b w:val="0"/>
+                <w:color w:val="656575"/>
+                <w:sz w:val="15"/>
+              </w:rPr>
+            </w:r>
+          </w:p>
+          <w:p>
+            <w:pPr>
+              <w:keepNext w:val="0"/>
+              <w:spacing w:before="0" w:after="0" w:line="900" w:lineRule="exact"/>
+              <w:jc w:val="left"/>
+            </w:pPr>
+            <w:r>
+              <w:rPr>
+                <w:rFonts w:ascii="Arial" w:hAnsi="Arial" w:cs="Bahij TheSansArabic Plain"/>
+                <w:b w:val="0"/>
+                <w:color w:val="242235"/>
+                <w:sz w:val="4"/>
+              </w:rPr>
+            </w:r>
+          </w:p>
         </w:tc>
       </w:tr>
+    </w:tbl>
+    <w:p>
+      <w:pPr>
+        <w:keepNext w:val="0"/>
+        <w:spacing w:before="0" w:after="0" w:line="2" w:lineRule="exact"/>
+        <w:jc w:val="left"/>
+      </w:pPr>
+      <w:r>
+        <w:rPr>
+          <w:rFonts w:ascii="Arial" w:hAnsi="Arial" w:cs="Bahij TheSansArabic Plain"/>
+          <w:b w:val="0"/>
+          <w:color w:val="242235"/>
+          <w:sz w:val="2"/>
+        </w:rPr>
+        <w:t xml:space="preserve"> </w:t>
+      </w:r>
+    </w:p>
+    <w:tbl>
+      <w:tblPr>
+        <w:tblW w:type="auto" w:w="0"/>
+        <w:jc w:val="center"/>
+        <w:tblLayout w:type="fixed"/>
+        <w:tblLook w:firstColumn="1" w:firstRow="1" w:lastColumn="0" w:lastRow="0" w:noHBand="0" w:noVBand="1" w:val="04A0"/>
+        <w:tblBorders>
+          <w:top w:val="single" w:sz="3" w:color="9B92A2"/>
+          <w:bottom w:val="single" w:sz="3" w:color="9B92A2"/>
+          <w:left w:val="single" w:sz="3" w:color="9B92A2"/>
+          <w:right w:val="single" w:sz="3" w:color="9B92A2"/>
+          <w:insideH w:val="single" w:sz="3" w:color="9B92A2"/>
+          <w:insideV w:val="single" w:sz="3" w:color="9B92A2"/>
+        </w:tblBorders>
+      </w:tblPr>
+      <w:tblGrid>
+        <w:gridCol w:w="9986"/>
+      </w:tblGrid>
       <w:tr>
         <w:trPr>
-          <w:trHeight w:val="567" w:hRule="exact"/>
+          <w:cantSplit/>
         </w:trPr>
         <w:tc>
           <w:tcPr>
-            <w:tcW w:type="dxa" w:w="4762"/>
-            <w:vAlign w:val="center"/>
+            <w:tcW w:type="dxa" w:w="9986"/>
+            <w:tcMar>
+              <w:top w:w="65" w:type="dxa"/>
+              <w:bottom w:w="55" w:type="dxa"/>
+              <w:left w:w="100" w:type="dxa"/>
+              <w:right w:w="100" w:type="dxa"/>
+            </w:tcMar>
+            <w:vAlign w:val="bottom"/>
           </w:tcPr>
           <w:p>
             <w:pPr>
-              <w:spacing w:line="340" w:lineRule="exact" w:after="0"/>
-              <w:jc w:val="start"/>
-              <w:bidi/>
-              <w:pBdr>
-                <w:bottom w:val="single" w:sz="4" w:color="555555" w:space="1"/>
-              </w:pBdr>
-            </w:pPr>
-          </w:p>
-        </w:tc>
-        <w:tc>
-          <w:tcPr>
-            <w:tcW w:type="dxa" w:w="1134"/>
-            <w:vAlign w:val="center"/>
-          </w:tcPr>
-          <w:p>
-            <w:pPr>
-              <w:spacing w:line="340" w:lineRule="exact" w:after="0"/>
+              <w:keepNext w:val="0"/>
+              <w:spacing w:before="0" w:after="0" w:line="260" w:lineRule="exact"/>
               <w:jc w:val="start"/>
               <w:bidi/>
             </w:pPr>
@@ -184,46 +288,100 @@
               <w:rPr>
                 <w:rFonts w:ascii="Bahij TheSansArabic Plain" w:hAnsi="Bahij TheSansArabic Plain" w:cs="Bahij TheSansArabic Plain"/>
                 <w:b w:val="0"/>
-                <w:color w:val="000000"/>
+                <w:color w:val="242235"/>
                 <w:sz w:val="19"/>
-                <w:u w:val="none"/>
                 <w:rtl/>
                 <w:szCs w:val="19"/>
-                <w:lang w:bidi="ar-SA"/>
               </w:rPr>
               <w:t>التوقيع:</w:t>
             </w:r>
           </w:p>
+          <w:p>
+            <w:pPr>
+              <w:keepNext w:val="0"/>
+              <w:spacing w:before="0" w:after="0" w:line="220" w:lineRule="exact"/>
+              <w:jc w:val="left"/>
+            </w:pPr>
+            <w:r>
+              <w:rPr>
+                <w:rFonts w:ascii="Arial" w:hAnsi="Arial" w:cs="Bahij TheSansArabic Plain"/>
+                <w:b w:val="0"/>
+                <w:color w:val="656575"/>
+                <w:sz w:val="15"/>
+              </w:rPr>
+            </w:r>
+          </w:p>
+          <w:p>
+            <w:pPr>
+              <w:keepNext w:val="0"/>
+              <w:spacing w:before="0" w:after="0" w:line="900" w:lineRule="exact"/>
+              <w:jc w:val="left"/>
+            </w:pPr>
+            <w:r>
+              <w:rPr>
+                <w:rFonts w:ascii="Arial" w:hAnsi="Arial" w:cs="Bahij TheSansArabic Plain"/>
+                <w:b w:val="0"/>
+                <w:color w:val="242235"/>
+                <w:sz w:val="4"/>
+              </w:rPr>
+            </w:r>
+          </w:p>
         </w:tc>
       </w:tr>
+    </w:tbl>
+    <w:p>
+      <w:pPr>
+        <w:keepNext w:val="0"/>
+        <w:spacing w:before="0" w:after="0" w:line="2" w:lineRule="exact"/>
+        <w:jc w:val="left"/>
+      </w:pPr>
+      <w:r>
+        <w:rPr>
+          <w:rFonts w:ascii="Arial" w:hAnsi="Arial" w:cs="Bahij TheSansArabic Plain"/>
+          <w:b w:val="0"/>
+          <w:color w:val="242235"/>
+          <w:sz w:val="2"/>
+        </w:rPr>
+        <w:t xml:space="preserve"> </w:t>
+      </w:r>
+    </w:p>
+    <w:tbl>
+      <w:tblPr>
+        <w:tblW w:type="auto" w:w="0"/>
+        <w:jc w:val="center"/>
+        <w:tblLayout w:type="fixed"/>
+        <w:tblLook w:firstColumn="1" w:firstRow="1" w:lastColumn="0" w:lastRow="0" w:noHBand="0" w:noVBand="1" w:val="04A0"/>
+        <w:tblBorders>
+          <w:top w:val="single" w:sz="3" w:color="9B92A2"/>
+          <w:bottom w:val="single" w:sz="3" w:color="9B92A2"/>
+          <w:left w:val="single" w:sz="3" w:color="9B92A2"/>
+          <w:right w:val="single" w:sz="3" w:color="9B92A2"/>
+          <w:insideH w:val="single" w:sz="3" w:color="9B92A2"/>
+          <w:insideV w:val="single" w:sz="3" w:color="9B92A2"/>
+        </w:tblBorders>
+      </w:tblPr>
+      <w:tblGrid>
+        <w:gridCol w:w="9986"/>
+      </w:tblGrid>
       <w:tr>
         <w:trPr>
-          <w:trHeight w:val="567" w:hRule="exact"/>
+          <w:cantSplit/>
         </w:trPr>
         <w:tc>
           <w:tcPr>
-            <w:tcW w:type="dxa" w:w="4762"/>
-            <w:vAlign w:val="center"/>
+            <w:tcW w:type="dxa" w:w="9986"/>
+            <w:tcMar>
+              <w:top w:w="65" w:type="dxa"/>
+              <w:bottom w:w="55" w:type="dxa"/>
+              <w:left w:w="100" w:type="dxa"/>
+              <w:right w:w="100" w:type="dxa"/>
+            </w:tcMar>
+            <w:vAlign w:val="bottom"/>
           </w:tcPr>
           <w:p>
             <w:pPr>
-              <w:spacing w:line="340" w:lineRule="exact" w:after="0"/>
-              <w:jc w:val="start"/>
-              <w:bidi/>
-              <w:pBdr>
-                <w:bottom w:val="single" w:sz="4" w:color="555555" w:space="1"/>
-              </w:pBdr>
-            </w:pPr>
-          </w:p>
-        </w:tc>
-        <w:tc>
-          <w:tcPr>
-            <w:tcW w:type="dxa" w:w="1134"/>
-            <w:vAlign w:val="center"/>
-          </w:tcPr>
-          <w:p>
-            <w:pPr>
-              <w:spacing w:line="340" w:lineRule="exact" w:after="0"/>
+              <w:keepNext w:val="0"/>
+              <w:spacing w:before="0" w:after="0" w:line="260" w:lineRule="exact"/>
               <w:jc w:val="start"/>
               <w:bidi/>
             </w:pPr>
@@ -231,14 +389,42 @@
               <w:rPr>
                 <w:rFonts w:ascii="Bahij TheSansArabic Plain" w:hAnsi="Bahij TheSansArabic Plain" w:cs="Bahij TheSansArabic Plain"/>
                 <w:b w:val="0"/>
-                <w:color w:val="000000"/>
+                <w:color w:val="242235"/>
                 <w:sz w:val="19"/>
-                <w:u w:val="none"/>
                 <w:rtl/>
                 <w:szCs w:val="19"/>
-                <w:lang w:bidi="ar-SA"/>
               </w:rPr>
               <w:t>التاريخ:</w:t>
+            </w:r>
+          </w:p>
+          <w:p>
+            <w:pPr>
+              <w:keepNext w:val="0"/>
+              <w:spacing w:before="0" w:after="0" w:line="220" w:lineRule="exact"/>
+              <w:jc w:val="left"/>
+            </w:pPr>
+            <w:r>
+              <w:rPr>
+                <w:rFonts w:ascii="Arial" w:hAnsi="Arial" w:cs="Bahij TheSansArabic Plain"/>
+                <w:b w:val="0"/>
+                <w:color w:val="656575"/>
+                <w:sz w:val="15"/>
+              </w:rPr>
+            </w:r>
+          </w:p>
+          <w:p>
+            <w:pPr>
+              <w:keepNext w:val="0"/>
+              <w:spacing w:before="0" w:after="0" w:line="900" w:lineRule="exact"/>
+              <w:jc w:val="left"/>
+            </w:pPr>
+            <w:r>
+              <w:rPr>
+                <w:rFonts w:ascii="Arial" w:hAnsi="Arial" w:cs="Bahij TheSansArabic Plain"/>
+                <w:b w:val="0"/>
+                <w:color w:val="242235"/>
+                <w:sz w:val="4"/>
+              </w:rPr>
             </w:r>
           </w:p>
         </w:tc>
@@ -246,116 +432,119 @@
     </w:tbl>
     <w:p>
       <w:pPr>
-        <w:spacing w:line="20" w:lineRule="exact" w:after="1840"/>
-        <w:jc w:val="start"/>
-        <w:bidi/>
+        <w:keepNext w:val="0"/>
+        <w:spacing w:before="0" w:after="0" w:line="2" w:lineRule="exact"/>
+        <w:jc w:val="left"/>
       </w:pPr>
+      <w:r>
+        <w:rPr>
+          <w:rFonts w:ascii="Arial" w:hAnsi="Arial" w:cs="Bahij TheSansArabic Plain"/>
+          <w:b w:val="0"/>
+          <w:color w:val="242235"/>
+          <w:sz w:val="2"/>
+        </w:rPr>
+        <w:t xml:space="preserve"> </w:t>
+      </w:r>
+    </w:p>
+    <w:p>
+      <w:pPr>
+        <w:keepNext w:val="0"/>
+        <w:spacing w:before="0" w:after="0" w:line="900" w:lineRule="exact"/>
+        <w:jc w:val="left"/>
+      </w:pPr>
+      <w:r>
+        <w:rPr>
+          <w:rFonts w:ascii="Arial" w:hAnsi="Arial" w:cs="Bahij TheSansArabic Plain"/>
+          <w:b w:val="0"/>
+          <w:color w:val="242235"/>
+          <w:sz w:val="2"/>
+        </w:rPr>
+        <w:t xml:space="preserve"> </w:t>
+      </w:r>
     </w:p>
     <w:tbl>
       <w:tblPr>
         <w:tblW w:type="auto" w:w="0"/>
+        <w:jc w:val="center"/>
         <w:tblLayout w:type="fixed"/>
         <w:tblLook w:firstColumn="1" w:firstRow="1" w:lastColumn="0" w:lastRow="0" w:noHBand="0" w:noVBand="1" w:val="04A0"/>
         <w:tblBorders>
-          <w:top w:val="nil"/>
-          <w:left w:val="nil"/>
-          <w:bottom w:val="nil"/>
-          <w:right w:val="nil"/>
-          <w:insideH w:val="nil"/>
-          <w:insideV w:val="nil"/>
+          <w:top w:val="nil" w:sz="3" w:color="9B92A2"/>
+          <w:bottom w:val="nil" w:sz="3" w:color="9B92A2"/>
+          <w:left w:val="nil" w:sz="3" w:color="9B92A2"/>
+          <w:right w:val="nil" w:sz="3" w:color="9B92A2"/>
+          <w:insideH w:val="nil" w:sz="3" w:color="9B92A2"/>
+          <w:insideV w:val="nil" w:sz="3" w:color="9B92A2"/>
         </w:tblBorders>
       </w:tblPr>
       <w:tblGrid>
-        <w:gridCol w:w="4706"/>
-        <w:gridCol w:w="4706"/>
+        <w:gridCol w:w="4993"/>
+        <w:gridCol w:w="4993"/>
       </w:tblGrid>
       <w:tr>
+        <w:trPr>
+          <w:cantSplit/>
+        </w:trPr>
         <w:tc>
           <w:tcPr>
-            <w:tcW w:type="dxa" w:w="4706"/>
+            <w:tcW w:type="dxa" w:w="4993"/>
+            <w:tcMar>
+              <w:top w:w="65" w:type="dxa"/>
+              <w:bottom w:w="55" w:type="dxa"/>
+              <w:left w:w="100" w:type="dxa"/>
+              <w:right w:w="100" w:type="dxa"/>
+            </w:tcMar>
           </w:tcPr>
           <w:p>
             <w:pPr>
-              <w:spacing w:line="340" w:lineRule="exact" w:after="0"/>
-              <w:jc w:val="center"/>
+              <w:keepNext w:val="0"/>
+              <w:spacing w:before="0" w:after="0" w:line="320" w:lineRule="exact"/>
+              <w:jc w:val="start"/>
               <w:bidi/>
             </w:pPr>
             <w:r>
               <w:rPr>
                 <w:rFonts w:ascii="Bahij TheSansArabic Plain" w:hAnsi="Bahij TheSansArabic Plain" w:cs="Bahij TheSansArabic Plain"/>
                 <w:b w:val="0"/>
-                <w:color w:val="000000"/>
-                <w:sz w:val="21"/>
-                <w:u w:val="none"/>
+                <w:color w:val="242235"/>
+                <w:sz w:val="20"/>
                 <w:rtl/>
-                <w:szCs w:val="21"/>
-                <w:lang w:bidi="ar-SA"/>
+                <w:szCs w:val="20"/>
               </w:rPr>
               <w:t>العضو المنتدب والرئيس التنفيذي</w:t>
+              <w:br/>
+              <w:t>د. محمد بسام هاشم السيد</w:t>
             </w:r>
           </w:p>
+        </w:tc>
+        <w:tc>
+          <w:tcPr>
+            <w:tcW w:type="dxa" w:w="4993"/>
+            <w:tcMar>
+              <w:top w:w="65" w:type="dxa"/>
+              <w:bottom w:w="55" w:type="dxa"/>
+              <w:left w:w="100" w:type="dxa"/>
+              <w:right w:w="100" w:type="dxa"/>
+            </w:tcMar>
+          </w:tcPr>
           <w:p>
             <w:pPr>
-              <w:spacing w:line="340" w:lineRule="exact" w:after="0"/>
-              <w:jc w:val="center"/>
+              <w:keepNext w:val="0"/>
+              <w:spacing w:before="0" w:after="0" w:line="320" w:lineRule="exact"/>
+              <w:jc w:val="start"/>
               <w:bidi/>
             </w:pPr>
             <w:r>
               <w:rPr>
                 <w:rFonts w:ascii="Bahij TheSansArabic Plain" w:hAnsi="Bahij TheSansArabic Plain" w:cs="Bahij TheSansArabic Plain"/>
                 <w:b w:val="0"/>
-                <w:color w:val="000000"/>
-                <w:sz w:val="21"/>
-                <w:u w:val="none"/>
+                <w:color w:val="242235"/>
+                <w:sz w:val="20"/>
                 <w:rtl/>
-                <w:szCs w:val="21"/>
-                <w:lang w:bidi="ar-SA"/>
-              </w:rPr>
-              <w:t>د. محمد بسام هاشم السيد</w:t>
-            </w:r>
-          </w:p>
-        </w:tc>
-        <w:tc>
-          <w:tcPr>
-            <w:tcW w:type="dxa" w:w="4706"/>
-          </w:tcPr>
-          <w:p>
-            <w:pPr>
-              <w:spacing w:line="340" w:lineRule="exact" w:after="0"/>
-              <w:jc w:val="center"/>
-              <w:bidi/>
-            </w:pPr>
-            <w:r>
-              <w:rPr>
-                <w:rFonts w:ascii="Bahij TheSansArabic Plain" w:hAnsi="Bahij TheSansArabic Plain" w:cs="Bahij TheSansArabic Plain"/>
-                <w:b w:val="0"/>
-                <w:color w:val="000000"/>
-                <w:sz w:val="21"/>
-                <w:u w:val="none"/>
-                <w:rtl/>
-                <w:szCs w:val="21"/>
-                <w:lang w:bidi="ar-SA"/>
+                <w:szCs w:val="20"/>
               </w:rPr>
               <w:t>مسؤول المطابقة والالتزام</w:t>
-            </w:r>
-          </w:p>
-          <w:p>
-            <w:pPr>
-              <w:spacing w:line="340" w:lineRule="exact" w:after="0"/>
-              <w:jc w:val="center"/>
-              <w:bidi/>
-            </w:pPr>
-            <w:r>
-              <w:rPr>
-                <w:rFonts w:ascii="Bahij TheSansArabic Plain" w:hAnsi="Bahij TheSansArabic Plain" w:cs="Bahij TheSansArabic Plain"/>
-                <w:b w:val="0"/>
-                <w:color w:val="000000"/>
-                <w:sz w:val="21"/>
-                <w:u w:val="none"/>
-                <w:rtl/>
-                <w:szCs w:val="21"/>
-                <w:lang w:bidi="ar-SA"/>
-              </w:rPr>
+              <w:br/>
               <w:t>أسامه فايز المالكي</w:t>
             </w:r>
           </w:p>
@@ -363,13 +552,169 @@
       </w:tr>
     </w:tbl>
     <w:sectPr>
+      <w:footerReference w:type="default" r:id="rId9"/>
+      <w:headerReference w:type="default" r:id="rId11"/>
       <w:pgSz w:w="11906" w:h="16838"/>
-      <w:pgMar w:top="1020" w:right="1247" w:bottom="1247" w:left="1247" w:header="720" w:footer="720" w:gutter="0"/>
+      <w:pgMar w:top="1860" w:right="960" w:bottom="1220" w:left="960" w:header="400" w:footer="240" w:gutter="0"/>
       <w:cols w:space="720"/>
       <w:docGrid w:linePitch="360"/>
     </w:sectPr>
   </w:body>
 </w:document>
+</file>
+
+<file path=word/footer1.xml><?xml version="1.0" encoding="utf-8"?>
+<w:ftr xmlns:m="http://schemas.openxmlformats.org/officeDocument/2006/math" xmlns:mc="http://schemas.openxmlformats.org/markup-compatibility/2006" xmlns:mo="http://schemas.microsoft.com/office/mac/office/2008/main" xmlns:mv="urn:schemas-microsoft-com:mac:vml" xmlns:o="urn:schemas-microsoft-com:office:office" xmlns:r="http://schemas.openxmlformats.org/officeDocument/2006/relationships" xmlns:v="urn:schemas-microsoft-com:vml" xmlns:w10="urn:schemas-microsoft-com:office:word" xmlns:w14="http://schemas.microsoft.com/office/word/2010/wordml" xmlns:w="http://schemas.openxmlformats.org/wordprocessingml/2006/main" xmlns:wne="http://schemas.microsoft.com/office/word/2006/wordml" xmlns:wp14="http://schemas.microsoft.com/office/word/2010/wordprocessingDrawing" xmlns:wp="http://schemas.openxmlformats.org/drawingml/2006/wordprocessingDrawing" xmlns:wpc="http://schemas.microsoft.com/office/word/2010/wordprocessingCanvas" xmlns:wpg="http://schemas.microsoft.com/office/word/2010/wordprocessingGroup" xmlns:wpi="http://schemas.microsoft.com/office/word/2010/wordprocessingInk" xmlns:wps="http://schemas.microsoft.com/office/word/2010/wordprocessingShape" mc:Ignorable="w14 wp14">
+  <w:p>
+    <w:pPr>
+      <w:keepNext w:val="0"/>
+      <w:spacing w:before="0" w:after="0" w:line="196" w:lineRule="exact"/>
+      <w:jc w:val="left"/>
+    </w:pPr>
+    <w:r>
+      <w:rPr>
+        <w:rFonts w:ascii="Arial" w:hAnsi="Arial" w:cs="Bahij TheSansArabic Plain"/>
+        <w:b w:val="0"/>
+        <w:color w:val="656575"/>
+        <w:sz w:val="14"/>
+      </w:rPr>
+    </w:r>
+  </w:p>
+  <w:p>
+    <w:pPr>
+      <w:jc w:val="center"/>
+    </w:pPr>
+    <w:fldSimple w:instr="PAGE"/>
+  </w:p>
+</w:ftr>
+</file>
+
+<file path=word/header1.xml><?xml version="1.0" encoding="utf-8"?>
+<w:hdr xmlns:m="http://schemas.openxmlformats.org/officeDocument/2006/math" xmlns:mc="http://schemas.openxmlformats.org/markup-compatibility/2006" xmlns:mo="http://schemas.microsoft.com/office/mac/office/2008/main" xmlns:mv="urn:schemas-microsoft-com:mac:vml" xmlns:o="urn:schemas-microsoft-com:office:office" xmlns:r="http://schemas.openxmlformats.org/officeDocument/2006/relationships" xmlns:v="urn:schemas-microsoft-com:vml" xmlns:w10="urn:schemas-microsoft-com:office:word" xmlns:w14="http://schemas.microsoft.com/office/word/2010/wordml" xmlns:w="http://schemas.openxmlformats.org/wordprocessingml/2006/main" xmlns:wne="http://schemas.microsoft.com/office/word/2006/wordml" xmlns:wp14="http://schemas.microsoft.com/office/word/2010/wordprocessingDrawing" xmlns:wp="http://schemas.openxmlformats.org/drawingml/2006/wordprocessingDrawing" xmlns:wpc="http://schemas.microsoft.com/office/word/2010/wordprocessingCanvas" xmlns:wpg="http://schemas.microsoft.com/office/word/2010/wordprocessingGroup" xmlns:wpi="http://schemas.microsoft.com/office/word/2010/wordprocessingInk" xmlns:wps="http://schemas.microsoft.com/office/word/2010/wordprocessingShape" mc:Ignorable="w14 wp14">
+  <w:p>
+    <w:pPr>
+      <w:pStyle w:val="Header"/>
+    </w:pPr>
+  </w:p>
+  <w:tbl>
+    <w:tblPr>
+      <w:tblW w:type="auto" w:w="0"/>
+      <w:jc w:val="center"/>
+      <w:tblLayout w:type="fixed"/>
+      <w:tblLook w:firstColumn="1" w:firstRow="1" w:lastColumn="0" w:lastRow="0" w:noHBand="0" w:noVBand="1" w:val="04A0"/>
+      <w:tblBorders>
+        <w:top w:val="nil" w:sz="3" w:color="9B92A2"/>
+        <w:bottom w:val="nil" w:sz="3" w:color="9B92A2"/>
+        <w:left w:val="nil" w:sz="3" w:color="9B92A2"/>
+        <w:right w:val="nil" w:sz="3" w:color="9B92A2"/>
+        <w:insideH w:val="nil" w:sz="3" w:color="9B92A2"/>
+        <w:insideV w:val="nil" w:sz="3" w:color="9B92A2"/>
+      </w:tblBorders>
+    </w:tblPr>
+    <w:tblGrid>
+      <w:gridCol w:w="2820"/>
+      <w:gridCol w:w="7166"/>
+    </w:tblGrid>
+    <w:tr>
+      <w:trPr>
+        <w:cantSplit/>
+      </w:trPr>
+      <w:tc>
+        <w:tcPr>
+          <w:tcW w:type="dxa" w:w="2820"/>
+          <w:tcMar>
+            <w:top w:w="65" w:type="dxa"/>
+            <w:bottom w:w="55" w:type="dxa"/>
+            <w:left w:w="100" w:type="dxa"/>
+            <w:right w:w="100" w:type="dxa"/>
+          </w:tcMar>
+        </w:tcPr>
+        <w:p>
+          <w:r>
+            <w:drawing>
+              <wp:inline xmlns:a="http://schemas.openxmlformats.org/drawingml/2006/main" xmlns:pic="http://schemas.openxmlformats.org/drawingml/2006/picture">
+                <wp:extent cx="1625600" cy="616299"/>
+                <wp:docPr id="1" name="Picture 1"/>
+                <wp:cNvGraphicFramePr>
+                  <a:graphicFrameLocks noChangeAspect="1"/>
+                </wp:cNvGraphicFramePr>
+                <a:graphic>
+                  <a:graphicData uri="http://schemas.openxmlformats.org/drawingml/2006/picture">
+                    <pic:pic>
+                      <pic:nvPicPr>
+                        <pic:cNvPr id="0" name="image.png"/>
+                        <pic:cNvPicPr/>
+                      </pic:nvPicPr>
+                      <pic:blipFill>
+                        <a:blip r:embed="rId1"/>
+                        <a:stretch>
+                          <a:fillRect/>
+                        </a:stretch>
+                      </pic:blipFill>
+                      <pic:spPr>
+                        <a:xfrm>
+                          <a:off x="0" y="0"/>
+                          <a:ext cx="1625600" cy="616299"/>
+                        </a:xfrm>
+                        <a:prstGeom prst="rect"/>
+                      </pic:spPr>
+                    </pic:pic>
+                  </a:graphicData>
+                </a:graphic>
+              </wp:inline>
+            </w:drawing>
+          </w:r>
+        </w:p>
+      </w:tc>
+      <w:tc>
+        <w:tcPr>
+          <w:tcW w:type="dxa" w:w="7166"/>
+          <w:tcMar>
+            <w:top w:w="65" w:type="dxa"/>
+            <w:bottom w:w="55" w:type="dxa"/>
+            <w:left w:w="100" w:type="dxa"/>
+            <w:right w:w="100" w:type="dxa"/>
+          </w:tcMar>
+        </w:tcPr>
+        <w:p>
+          <w:pPr>
+            <w:keepNext w:val="0"/>
+            <w:spacing w:before="0" w:after="0" w:line="380" w:lineRule="exact"/>
+            <w:jc w:val="start"/>
+            <w:bidi/>
+          </w:pPr>
+          <w:r>
+            <w:rPr>
+              <w:rFonts w:ascii="Bahij TheSansArabic Plain" w:hAnsi="Bahij TheSansArabic Plain" w:cs="Bahij TheSansArabic Plain"/>
+              <w:b/>
+              <w:color w:val="401D58"/>
+              <w:sz w:val="28"/>
+              <w:rtl/>
+              <w:szCs w:val="28"/>
+              <w:bCs/>
+            </w:rPr>
+            <w:t>إتقان كابيتال | صندوق النعيم العقاري</w:t>
+          </w:r>
+        </w:p>
+        <w:p>
+          <w:pPr>
+            <w:keepNext w:val="0"/>
+            <w:spacing w:before="0" w:after="0" w:line="240" w:lineRule="exact"/>
+            <w:jc w:val="right"/>
+          </w:pPr>
+          <w:r>
+            <w:rPr>
+              <w:rFonts w:ascii="Arial" w:hAnsi="Arial" w:cs="Bahij TheSansArabic Plain"/>
+              <w:b/>
+              <w:color w:val="656575"/>
+              <w:sz w:val="18"/>
+            </w:rPr>
+          </w:r>
+        </w:p>
+      </w:tc>
+    </w:tr>
+  </w:tbl>
+</w:hdr>
 </file>
 
 <file path=word/numbering.xml><?xml version="1.0" encoding="utf-8"?>
@@ -735,10 +1080,12 @@
     <w:name w:val="Normal"/>
     <w:qFormat/>
     <w:rsid w:val="00FC693F"/>
+    <w:pPr>
+      <w:spacing w:after="0"/>
+    </w:pPr>
     <w:rPr>
-      <w:rFonts w:ascii="Bahij TheSansArabic Plain" w:hAnsi="Bahij TheSansArabic Plain"/>
-      <w:color w:val="000000"/>
-      <w:sz w:val="19"/>
+      <w:rFonts w:ascii="Arial" w:hAnsi="Arial"/>
+      <w:sz w:val="20"/>
     </w:rPr>
   </w:style>
   <w:style w:type="paragraph" w:styleId="Header">
@@ -1566,6 +1913,9 @@
     <w:qFormat/>
     <w:rsid w:val="00FC693F"/>
     <w:pPr>
+      <w:pBdr>
+        <w:bottom w:val="single" w:sz="4" w:space="4" w:color="4F81BD" w:themeColor="accent1"/>
+      </w:pBdr>
       <w:spacing w:before="200" w:after="280"/>
       <w:ind w:left="936" w:right="936"/>
     </w:pPr>

</xml_diff>

<commit_message>
Restore original signature PDF and refine document section layouts
</commit_message>
<xml_diff>
--- a/output/documents/al-naeem-terms-consent.docx
+++ b/output/documents/al-naeem-terms-consent.docx
@@ -5,8 +5,23 @@
     <w:p>
       <w:pPr>
         <w:keepNext/>
-        <w:spacing w:before="100" w:after="60" w:line="380" w:lineRule="exact"/>
-        <w:ind w:left="120" w:right="120"/>
+        <w:spacing w:before="0" w:after="0" w:line="100" w:lineRule="exact"/>
+        <w:jc w:val="left"/>
+      </w:pPr>
+      <w:r>
+        <w:rPr>
+          <w:rFonts w:ascii="Arial" w:hAnsi="Arial" w:cs="Bahij TheSansArabic Plain"/>
+          <w:b w:val="0"/>
+          <w:color w:val="242235"/>
+          <w:sz w:val="2"/>
+        </w:rPr>
+      </w:r>
+    </w:p>
+    <w:p>
+      <w:pPr>
+        <w:keepNext/>
+        <w:spacing w:before="0" w:after="60" w:line="380" w:lineRule="exact"/>
+        <w:ind w:left="0" w:right="0" w:firstLine="100"/>
         <w:jc w:val="right"/>
         <w:shd w:fill="401D58"/>
       </w:pPr>
@@ -117,8 +132,23 @@
     <w:p>
       <w:pPr>
         <w:keepNext/>
-        <w:spacing w:before="100" w:after="60" w:line="380" w:lineRule="exact"/>
-        <w:ind w:left="120" w:right="120"/>
+        <w:spacing w:before="0" w:after="0" w:line="100" w:lineRule="exact"/>
+        <w:jc w:val="left"/>
+      </w:pPr>
+      <w:r>
+        <w:rPr>
+          <w:rFonts w:ascii="Arial" w:hAnsi="Arial" w:cs="Bahij TheSansArabic Plain"/>
+          <w:b w:val="0"/>
+          <w:color w:val="242235"/>
+          <w:sz w:val="2"/>
+        </w:rPr>
+      </w:r>
+    </w:p>
+    <w:p>
+      <w:pPr>
+        <w:keepNext/>
+        <w:spacing w:before="0" w:after="60" w:line="380" w:lineRule="exact"/>
+        <w:ind w:left="0" w:right="0" w:firstLine="100"/>
         <w:jc w:val="right"/>
         <w:shd w:fill="401D58"/>
       </w:pPr>
@@ -159,7 +189,8 @@
         </w:tblBorders>
       </w:tblPr>
       <w:tblGrid>
-        <w:gridCol w:w="9986"/>
+        <w:gridCol w:w="4993"/>
+        <w:gridCol w:w="4993"/>
       </w:tblGrid>
       <w:tr>
         <w:trPr>
@@ -167,7 +198,68 @@
         </w:trPr>
         <w:tc>
           <w:tcPr>
-            <w:tcW w:type="dxa" w:w="9986"/>
+            <w:tcW w:type="dxa" w:w="4993"/>
+            <w:tcMar>
+              <w:top w:w="65" w:type="dxa"/>
+              <w:bottom w:w="55" w:type="dxa"/>
+              <w:left w:w="100" w:type="dxa"/>
+              <w:right w:w="100" w:type="dxa"/>
+            </w:tcMar>
+            <w:vAlign w:val="bottom"/>
+          </w:tcPr>
+          <w:p>
+            <w:pPr>
+              <w:keepNext w:val="0"/>
+              <w:spacing w:before="0" w:after="0" w:line="260" w:lineRule="exact"/>
+              <w:jc w:val="start"/>
+              <w:bidi/>
+            </w:pPr>
+            <w:r>
+              <w:rPr>
+                <w:rFonts w:ascii="Bahij TheSansArabic Plain" w:hAnsi="Bahij TheSansArabic Plain" w:cs="Bahij TheSansArabic Plain"/>
+                <w:b w:val="0"/>
+                <w:color w:val="242235"/>
+                <w:sz w:val="19"/>
+                <w:rtl/>
+                <w:szCs w:val="19"/>
+              </w:rPr>
+              <w:t>التوقيع:</w:t>
+            </w:r>
+          </w:p>
+          <w:p>
+            <w:pPr>
+              <w:keepNext w:val="0"/>
+              <w:spacing w:before="0" w:after="0" w:line="220" w:lineRule="exact"/>
+              <w:jc w:val="left"/>
+            </w:pPr>
+            <w:r>
+              <w:rPr>
+                <w:rFonts w:ascii="Arial" w:hAnsi="Arial" w:cs="Bahij TheSansArabic Plain"/>
+                <w:b w:val="0"/>
+                <w:color w:val="656575"/>
+                <w:sz w:val="15"/>
+              </w:rPr>
+            </w:r>
+          </w:p>
+          <w:p>
+            <w:pPr>
+              <w:keepNext w:val="0"/>
+              <w:spacing w:before="0" w:after="0" w:line="1100" w:lineRule="exact"/>
+              <w:jc w:val="left"/>
+            </w:pPr>
+            <w:r>
+              <w:rPr>
+                <w:rFonts w:ascii="Arial" w:hAnsi="Arial" w:cs="Bahij TheSansArabic Plain"/>
+                <w:b w:val="0"/>
+                <w:color w:val="242235"/>
+                <w:sz w:val="4"/>
+              </w:rPr>
+            </w:r>
+          </w:p>
+        </w:tc>
+        <w:tc>
+          <w:tcPr>
+            <w:tcW w:type="dxa" w:w="4993"/>
             <w:tcMar>
               <w:top w:w="65" w:type="dxa"/>
               <w:bottom w:w="55" w:type="dxa"/>
@@ -213,108 +305,7 @@
           <w:p>
             <w:pPr>
               <w:keepNext w:val="0"/>
-              <w:spacing w:before="0" w:after="0" w:line="900" w:lineRule="exact"/>
-              <w:jc w:val="left"/>
-            </w:pPr>
-            <w:r>
-              <w:rPr>
-                <w:rFonts w:ascii="Arial" w:hAnsi="Arial" w:cs="Bahij TheSansArabic Plain"/>
-                <w:b w:val="0"/>
-                <w:color w:val="242235"/>
-                <w:sz w:val="4"/>
-              </w:rPr>
-            </w:r>
-          </w:p>
-        </w:tc>
-      </w:tr>
-    </w:tbl>
-    <w:p>
-      <w:pPr>
-        <w:keepNext w:val="0"/>
-        <w:spacing w:before="0" w:after="0" w:line="2" w:lineRule="exact"/>
-        <w:jc w:val="left"/>
-      </w:pPr>
-      <w:r>
-        <w:rPr>
-          <w:rFonts w:ascii="Arial" w:hAnsi="Arial" w:cs="Bahij TheSansArabic Plain"/>
-          <w:b w:val="0"/>
-          <w:color w:val="242235"/>
-          <w:sz w:val="2"/>
-        </w:rPr>
-        <w:t xml:space="preserve"> </w:t>
-      </w:r>
-    </w:p>
-    <w:tbl>
-      <w:tblPr>
-        <w:tblW w:type="auto" w:w="0"/>
-        <w:jc w:val="center"/>
-        <w:tblLayout w:type="fixed"/>
-        <w:tblLook w:firstColumn="1" w:firstRow="1" w:lastColumn="0" w:lastRow="0" w:noHBand="0" w:noVBand="1" w:val="04A0"/>
-        <w:tblBorders>
-          <w:top w:val="single" w:sz="3" w:color="9B92A2"/>
-          <w:bottom w:val="single" w:sz="3" w:color="9B92A2"/>
-          <w:left w:val="single" w:sz="3" w:color="9B92A2"/>
-          <w:right w:val="single" w:sz="3" w:color="9B92A2"/>
-          <w:insideH w:val="single" w:sz="3" w:color="9B92A2"/>
-          <w:insideV w:val="single" w:sz="3" w:color="9B92A2"/>
-        </w:tblBorders>
-      </w:tblPr>
-      <w:tblGrid>
-        <w:gridCol w:w="9986"/>
-      </w:tblGrid>
-      <w:tr>
-        <w:trPr>
-          <w:cantSplit/>
-        </w:trPr>
-        <w:tc>
-          <w:tcPr>
-            <w:tcW w:type="dxa" w:w="9986"/>
-            <w:tcMar>
-              <w:top w:w="65" w:type="dxa"/>
-              <w:bottom w:w="55" w:type="dxa"/>
-              <w:left w:w="100" w:type="dxa"/>
-              <w:right w:w="100" w:type="dxa"/>
-            </w:tcMar>
-            <w:vAlign w:val="bottom"/>
-          </w:tcPr>
-          <w:p>
-            <w:pPr>
-              <w:keepNext w:val="0"/>
-              <w:spacing w:before="0" w:after="0" w:line="260" w:lineRule="exact"/>
-              <w:jc w:val="start"/>
-              <w:bidi/>
-            </w:pPr>
-            <w:r>
-              <w:rPr>
-                <w:rFonts w:ascii="Bahij TheSansArabic Plain" w:hAnsi="Bahij TheSansArabic Plain" w:cs="Bahij TheSansArabic Plain"/>
-                <w:b w:val="0"/>
-                <w:color w:val="242235"/>
-                <w:sz w:val="19"/>
-                <w:rtl/>
-                <w:szCs w:val="19"/>
-              </w:rPr>
-              <w:t>التوقيع:</w:t>
-            </w:r>
-          </w:p>
-          <w:p>
-            <w:pPr>
-              <w:keepNext w:val="0"/>
-              <w:spacing w:before="0" w:after="0" w:line="220" w:lineRule="exact"/>
-              <w:jc w:val="left"/>
-            </w:pPr>
-            <w:r>
-              <w:rPr>
-                <w:rFonts w:ascii="Arial" w:hAnsi="Arial" w:cs="Bahij TheSansArabic Plain"/>
-                <w:b w:val="0"/>
-                <w:color w:val="656575"/>
-                <w:sz w:val="15"/>
-              </w:rPr>
-            </w:r>
-          </w:p>
-          <w:p>
-            <w:pPr>
-              <w:keepNext w:val="0"/>
-              <w:spacing w:before="0" w:after="0" w:line="900" w:lineRule="exact"/>
+              <w:spacing w:before="0" w:after="0" w:line="1100" w:lineRule="exact"/>
               <w:jc w:val="left"/>
             </w:pPr>
             <w:r>
@@ -415,7 +406,7 @@
           <w:p>
             <w:pPr>
               <w:keepNext w:val="0"/>
-              <w:spacing w:before="0" w:after="0" w:line="900" w:lineRule="exact"/>
+              <w:spacing w:before="0" w:after="0" w:line="600" w:lineRule="exact"/>
               <w:jc w:val="left"/>
             </w:pPr>
             <w:r>

</xml_diff>

<commit_message>
Update the national address on every current form
</commit_message>
<xml_diff>
--- a/output/documents/al-naeem-terms-consent.docx
+++ b/output/documents/al-naeem-terms-consent.docx
@@ -573,6 +573,22 @@
   </w:p>
   <w:p>
     <w:pPr>
+      <w:keepNext w:val="0"/>
+      <w:spacing w:before="0" w:after="0" w:line="180" w:lineRule="exact"/>
+      <w:jc w:val="center"/>
+    </w:pPr>
+    <w:r>
+      <w:rPr>
+        <w:rFonts w:ascii="Arial" w:hAnsi="Arial" w:cs="Bahij TheSansArabic Plain"/>
+        <w:b w:val="0"/>
+        <w:color w:val="656575"/>
+        <w:sz w:val="14"/>
+      </w:rPr>
+      <w:t>Al Zahraa District - Prince Naif Branch - Al Saha Square, 1st Floor | 2505 - Al Zahra Dist | Unit No 7940 | Jeddah 23425-2753 | Kingdom of Saudi Arabia</w:t>
+    </w:r>
+  </w:p>
+  <w:p>
+    <w:pPr>
       <w:jc w:val="center"/>
     </w:pPr>
     <w:fldSimple w:instr="PAGE"/>

</xml_diff>